<commit_message>
Update SC4052 Cloud Computing.docx
</commit_message>
<xml_diff>
--- a/ass2/SC4052 Cloud Computing.docx
+++ b/ass2/SC4052 Cloud Computing.docx
@@ -193,7 +193,6 @@
     </w:p>
     <w:p>
       <w:pPr>
-        <w:spacing w:before="80" w:after="120"/>
         <w:rPr>
           <w:rFonts w:ascii="Arial" w:eastAsia="Arial" w:hAnsi="Arial" w:cs="Arial"/>
         </w:rPr>
@@ -202,7 +201,7 @@
         <w:rPr>
           <w:rFonts w:ascii="Arial" w:eastAsia="Arial" w:hAnsi="Arial" w:cs="Arial"/>
         </w:rPr>
-        <w:t>This report addresses Question 6 of SC4052 Assignment 2. It derives the PageRank vector in closed form from the Google matrix formulation, then explains how the teleportation probability p governs the trade-off between link-dominated authority and uniform exploration using a purpose-built six-node toy graph. Three independent solvers are implemented in Python: power iteration, direct closed-form linear solve, and a Monte Carlo random-walk simulator. All three methods are cross-validated on a 200-node subgraph, with power iteration and closed form achieving machine-precision agreement (L1 error 1.6×10</w:t>
+        <w:t>This report covers Question 6 of SC4052 Assignment 2. The PageRank vector is derived in closed form from the Google matrix, and the role of teleportation probability p is explored through a small six-node example graph. Three solvers are implemented in Python — power iteration, a direct linear solve, and a Monte Carlo random-walk approach — and compared against each other on a 200-node subgraph, where power iteration and the closed form match to L1 error 1.6×10</w:t>
       </w:r>
       <w:r>
         <w:rPr>
@@ -214,19 +213,21 @@
         <w:rPr>
           <w:rFonts w:ascii="Arial" w:eastAsia="Arial" w:hAnsi="Arial" w:cs="Arial"/>
         </w:rPr>
-        <w:t xml:space="preserve">¹⁶) and the Monte Carlo simulator achieving cosine similarity 0.9999. The full power-iteration solver is evaluated on the web-Google.txt dataset (875,713 nodes, 5,105,039 directed edges), converging in 118 iterations in 3.333 seconds. Finally, a GPTBot-like crawler is designed for a new AI research organisation: a program that takes a </w:t>
-      </w:r>
+        <w:t xml:space="preserve">¹⁶ and the Monte Carlo method reaches cosine similarity 0.9999. The power-iteration solver is then run on the full web-Google.txt dataset (875,713 nodes, 5,105,039 directed edges), taking 118 iterations and 3.333 seconds to converge. For the extension, a GPTBot-style crawler is </w:t>
+      </w:r>
+      <w:proofErr w:type="gramStart"/>
       <w:r>
         <w:rPr>
           <w:rFonts w:ascii="Arial" w:eastAsia="Arial" w:hAnsi="Arial" w:cs="Arial"/>
         </w:rPr>
-        <w:t>small, directed</w:t>
-      </w:r>
+        <w:t>built:</w:t>
+      </w:r>
+      <w:proofErr w:type="gramEnd"/>
       <w:r>
         <w:rPr>
           <w:rFonts w:ascii="Arial" w:eastAsia="Arial" w:hAnsi="Arial" w:cs="Arial"/>
         </w:rPr>
-        <w:t xml:space="preserve"> web graph of URLs and precomputed PageRank scores, and returns the top k URLs to crawl using a Permissive-Authority Heuristic — combining PageRank authority with URL content-richness classification and robots.txt compliance as a hard constraint. Full source code is available at: </w:t>
+        <w:t xml:space="preserve"> given a small URL graph and precomputed PageRank scores, it returns the top k pages to crawl using a Permissive-Authority Heuristic that weighs PageRank authority, a URL content-richness score, and robots.txt compliance. Full source code is available at: </w:t>
       </w:r>
     </w:p>
     <w:p>
@@ -316,7 +317,7 @@
         <w:rPr>
           <w:rFonts w:ascii="Arial" w:hAnsi="Arial" w:cs="Arial"/>
         </w:rPr>
-        <w:t xml:space="preserve">This report delivers three contributions. First, a rigorous closed-form derivation shows that PageRank satisfies a linear system whose solution is r = [I − (1−p) </w:t>
+        <w:t xml:space="preserve">Section 2 works through the closed-form derivation, showing that PageRank satisfies r = [I − (1−p) </w:t>
       </w:r>
       <w:proofErr w:type="gramStart"/>
       <w:r>
@@ -336,35 +337,21 @@
         <w:rPr>
           <w:rFonts w:ascii="Arial" w:hAnsi="Arial" w:cs="Arial"/>
         </w:rPr>
-        <w:t xml:space="preserve">¹ p </w:t>
+        <w:t xml:space="preserve">¹ p v and linking the spectral structure of that system to convergence behaviour. Section 4 covers the three solver implementations, which are </w:t>
       </w:r>
       <w:proofErr w:type="gramStart"/>
       <w:r>
         <w:rPr>
           <w:rFonts w:ascii="Arial" w:hAnsi="Arial" w:cs="Arial"/>
         </w:rPr>
-        <w:t>v, and</w:t>
+        <w:t>cross-validated</w:t>
       </w:r>
       <w:proofErr w:type="gramEnd"/>
       <w:r>
         <w:rPr>
           <w:rFonts w:ascii="Arial" w:hAnsi="Arial" w:cs="Arial"/>
         </w:rPr>
-        <w:t xml:space="preserve"> explains how the spectral properties of this system determine both the distribution of ranks and the convergence speed of iterative solvers. Second, three independent numerical methods are implemented and cross-validated, establishing correctness at machine precision. Third, a GPTBot-like crawler is designed for a new AI research organisation: a program that takes a small directed web graph of URL strings and their </w:t>
-      </w:r>
-      <w:proofErr w:type="spellStart"/>
-      <w:r>
-        <w:rPr>
-          <w:rFonts w:ascii="Arial" w:hAnsi="Arial" w:cs="Arial"/>
-        </w:rPr>
-        <w:t>outlinks</w:t>
-      </w:r>
-      <w:proofErr w:type="spellEnd"/>
-      <w:r>
-        <w:rPr>
-          <w:rFonts w:ascii="Arial" w:hAnsi="Arial" w:cs="Arial"/>
-        </w:rPr>
-        <w:t xml:space="preserve"> alongside precomputed PageRank scores, and returns the top k URLs to crawl based on authority, with one clearly-stated heuristic — the Permissive-Authority Score — to surface high-quality crawl-permitted pages.</w:t>
+        <w:t xml:space="preserve"> in Section 5 to confirm correctness. The extension in Section 8 builds a GPTBot-like crawler that ranks pages using the Permissive-Authority Score — a single heuristic combining PageRank, URL content richness, and robots.txt compliance.</w:t>
       </w:r>
     </w:p>
     <w:p>
@@ -1394,10 +1381,84 @@
       </w:pPr>
       <w:r>
         <w:rPr>
-          <w:rFonts w:ascii="Arial" w:hAnsi="Arial" w:cs="Arial"/>
-        </w:rPr>
-        <w:t>A six-node directed graph was constructed to illustrate these effects with a deliberately interesting topology: nodes 0, 1, 2 form a directed cycle (0→1→2→0); node 3 connects to 4 and 5; node 4 feeds back to 3 (a local sink pair); and node 5 bridges back to 0, making the whole graph strongly connected. This structure produces three meaningfully different authority levels: the main cycle (nodes 0-2), the bridge (node 5 which connects sinks back to the main component), and the sink pair (nodes 3-4).</w:t>
-      </w:r>
+          <w:rFonts w:ascii="Arial" w:hAnsi="Arial" w:cs="Arial" w:hint="eastAsia"/>
+        </w:rPr>
+        <w:t>To see these effects concretely, a six-node graph was built with three distinct structural roles: nodes 0, 1, 2 form a directed cycle (0</w:t>
+      </w:r>
+      <w:r>
+        <w:rPr>
+          <w:rFonts w:ascii="Arial" w:hAnsi="Arial" w:cs="Arial" w:hint="eastAsia"/>
+        </w:rPr>
+        <w:t>→</w:t>
+      </w:r>
+      <w:r>
+        <w:rPr>
+          <w:rFonts w:ascii="Arial" w:hAnsi="Arial" w:cs="Arial" w:hint="eastAsia"/>
+        </w:rPr>
+        <w:t>1</w:t>
+      </w:r>
+      <w:r>
+        <w:rPr>
+          <w:rFonts w:ascii="Arial" w:hAnsi="Arial" w:cs="Arial" w:hint="eastAsia"/>
+        </w:rPr>
+        <w:t>→</w:t>
+      </w:r>
+      <w:r>
+        <w:rPr>
+          <w:rFonts w:ascii="Arial" w:hAnsi="Arial" w:cs="Arial" w:hint="eastAsia"/>
+        </w:rPr>
+        <w:t>2</w:t>
+      </w:r>
+      <w:r>
+        <w:rPr>
+          <w:rFonts w:ascii="Arial" w:hAnsi="Arial" w:cs="Arial" w:hint="eastAsia"/>
+        </w:rPr>
+        <w:t>→</w:t>
+      </w:r>
+      <w:r>
+        <w:rPr>
+          <w:rFonts w:ascii="Arial" w:hAnsi="Arial" w:cs="Arial" w:hint="eastAsia"/>
+        </w:rPr>
+        <w:t>0); nodes 3 and 4 form a local sink pair (3</w:t>
+      </w:r>
+      <w:r>
+        <w:rPr>
+          <w:rFonts w:ascii="Arial" w:hAnsi="Arial" w:cs="Arial" w:hint="eastAsia"/>
+        </w:rPr>
+        <w:t>→</w:t>
+      </w:r>
+      <w:r>
+        <w:rPr>
+          <w:rFonts w:ascii="Arial" w:hAnsi="Arial" w:cs="Arial" w:hint="eastAsia"/>
+        </w:rPr>
+        <w:t>4</w:t>
+      </w:r>
+      <w:r>
+        <w:rPr>
+          <w:rFonts w:ascii="Arial" w:hAnsi="Arial" w:cs="Arial" w:hint="eastAsia"/>
+        </w:rPr>
+        <w:t>→</w:t>
+      </w:r>
+      <w:r>
+        <w:rPr>
+          <w:rFonts w:ascii="Arial" w:hAnsi="Arial" w:cs="Arial" w:hint="eastAsia"/>
+        </w:rPr>
+        <w:t>3); and node 5 acts as a bridge back to node 0, keeping the whole gra</w:t>
+      </w:r>
+      <w:r>
+        <w:rPr>
+          <w:rFonts w:ascii="Arial" w:hAnsi="Arial" w:cs="Arial"/>
+        </w:rPr>
+        <w:t>ph strongly connected. This gives three different authority levels to observe as p changes.</w:t>
+      </w:r>
+    </w:p>
+    <w:p>
+      <w:pPr>
+        <w:spacing w:before="80" w:after="120"/>
+        <w:rPr>
+          <w:rFonts w:ascii="Arial" w:hAnsi="Arial" w:cs="Arial"/>
+        </w:rPr>
+      </w:pPr>
     </w:p>
     <w:p>
       <w:pPr>
@@ -1537,19 +1598,17 @@
       </w:pPr>
       <w:r>
         <w:rPr>
+          <w:rFonts w:ascii="Arial" w:eastAsia="Arial" w:hAnsi="Arial" w:cs="Arial" w:hint="eastAsia"/>
+        </w:rPr>
+        <w:lastRenderedPageBreak/>
+        <w:t>The results match what the theory predicts: node 0 holds the highest rank at low p since it sits at the convergence point of the two sub-structures. As p increases the scores equalise, and by around p ≈ 0.5 the spread has mostly collapsed, which is consist</w:t>
+      </w:r>
+      <w:r>
+        <w:rPr>
           <w:rFonts w:ascii="Arial" w:eastAsia="Arial" w:hAnsi="Arial" w:cs="Arial"/>
         </w:rPr>
-        <w:lastRenderedPageBreak/>
-        <w:t>The toy graph confirms all three theoretical predictions: node 0 holds the highest rank at low p (it sits at the convergence point of the two connected components), ranks equalise as p increases, and the spread collapses at p ≈ 0.5, consistent with the spectral-gap analysis.</w:t>
-      </w:r>
-    </w:p>
-    <w:p>
-      <w:pPr>
-        <w:spacing w:before="80" w:after="120"/>
-        <w:rPr>
-          <w:rFonts w:ascii="Arial" w:hAnsi="Arial" w:cs="Arial"/>
-        </w:rPr>
-      </w:pPr>
+        <w:t>ent with the spectral-gap argument.</w:t>
+      </w:r>
     </w:p>
     <w:p>
       <w:pPr>
@@ -2857,7 +2916,19 @@
         <w:rPr>
           <w:rFonts w:ascii="Arial" w:hAnsi="Arial" w:cs="Arial"/>
         </w:rPr>
-        <w:t xml:space="preserve">ᵢ(S), where λᵢ(S) are the eigenvalues of the column-stochastic matrix S. Since |λᵢ(S)| ≤ 1 for all </w:t>
+        <w:t xml:space="preserve">ᵢ(S), where λᵢ(S) are the eigenvalues of the column-stochastic matrix S. Since |λᵢ(S)| </w:t>
+      </w:r>
+      <w:r>
+        <w:rPr>
+          <w:rFonts w:ascii="Arial" w:hAnsi="Arial" w:cs="Arial" w:hint="eastAsia"/>
+        </w:rPr>
+        <w:t>≤</w:t>
+      </w:r>
+      <w:r>
+        <w:rPr>
+          <w:rFonts w:ascii="Arial" w:hAnsi="Arial" w:cs="Arial"/>
+        </w:rPr>
+        <w:t xml:space="preserve"> 1 for all </w:t>
       </w:r>
       <w:proofErr w:type="spellStart"/>
       <w:r>
@@ -2885,14 +2956,14 @@
         <w:rPr>
           <w:rFonts w:ascii="Arial" w:hAnsi="Arial" w:cs="Arial"/>
         </w:rPr>
-        <w:t xml:space="preserve"> equals this bound in the worst case (e.g., a fully disconnected or reducible graph). In practice on </w:t>
+        <w:t xml:space="preserve"> equals this </w:t>
       </w:r>
       <w:r>
         <w:rPr>
           <w:rFonts w:ascii="Arial" w:hAnsi="Arial" w:cs="Arial"/>
         </w:rPr>
         <w:lastRenderedPageBreak/>
-        <w:t>the well-connected web-Google.txt graph, convergence to τ = 10</w:t>
+        <w:t>bound in the worst case (e.g., a fully disconnected or reducible graph). In practice on the well-connected web-Google.txt graph, convergence to τ = 10</w:t>
       </w:r>
       <w:r>
         <w:rPr>
@@ -2904,7 +2975,21 @@
         <w:rPr>
           <w:rFonts w:ascii="Arial" w:hAnsi="Arial" w:cs="Arial"/>
         </w:rPr>
-        <w:t xml:space="preserve">¹⁰ required 118 iterations in 3.333 seconds — demonstrating excellent scalability on a real web-scale dataset. Each iteration costs O(nnz) = </w:t>
+        <w:t>¹⁰ took 118 iterations and 3.333 seconds, with each iteration costing O(</w:t>
+      </w:r>
+      <w:proofErr w:type="spellStart"/>
+      <w:r>
+        <w:rPr>
+          <w:rFonts w:ascii="Arial" w:hAnsi="Arial" w:cs="Arial"/>
+        </w:rPr>
+        <w:t>nnz</w:t>
+      </w:r>
+      <w:proofErr w:type="spellEnd"/>
+      <w:r>
+        <w:rPr>
+          <w:rFonts w:ascii="Arial" w:hAnsi="Arial" w:cs="Arial"/>
+        </w:rPr>
+        <w:t xml:space="preserve">) = </w:t>
       </w:r>
       <w:proofErr w:type="gramStart"/>
       <w:r>
@@ -2918,16 +3003,8 @@
         <w:rPr>
           <w:rFonts w:ascii="Arial" w:hAnsi="Arial" w:cs="Arial"/>
         </w:rPr>
-        <w:t>5,105,039) sparse matrix-vector multiplications. The 136,259 dangling nodes (15.6% of the graph) are handled correctly via the dangling-mass redistribution formula, which is why convergence requires more iterations than on a synthetic graph with no dangling nodes.</w:t>
-      </w:r>
-    </w:p>
-    <w:p>
-      <w:pPr>
-        <w:spacing w:before="80" w:after="120"/>
-        <w:rPr>
-          <w:rFonts w:ascii="Arial" w:hAnsi="Arial" w:cs="Arial"/>
-        </w:rPr>
-      </w:pPr>
+        <w:t>5,105,039) sparse matrix-vector multiplications. The 136,259 dangling nodes (15.6%) slow things down somewhat compared to a clean synthetic graph, but the dangling-mass redistribution handles them correctly throughout.</w:t>
+      </w:r>
     </w:p>
     <w:p>
       <w:pPr>
@@ -4188,7 +4265,19 @@
         <w:rPr>
           <w:rFonts w:ascii="Arial" w:hAnsi="Arial" w:cs="Arial"/>
         </w:rPr>
-        <w:t>Node 597621 achieves the highest PageRank (0.000924). The mean PageRank across all 875,713 nodes is exactly 1/875,713 ≈ 1.14×10</w:t>
+        <w:t xml:space="preserve">Node 597621 comes out on top with PageRank 0.000924. The mean across all 875,713 nodes is 1/875,713 </w:t>
+      </w:r>
+      <w:r>
+        <w:rPr>
+          <w:rFonts w:ascii="Arial" w:hAnsi="Arial" w:cs="Arial" w:hint="eastAsia"/>
+        </w:rPr>
+        <w:t>≈</w:t>
+      </w:r>
+      <w:r>
+        <w:rPr>
+          <w:rFonts w:ascii="Arial" w:hAnsi="Arial" w:cs="Arial"/>
+        </w:rPr>
+        <w:t xml:space="preserve"> 1.14×10</w:t>
       </w:r>
       <w:r>
         <w:rPr>
@@ -4200,7 +4289,7 @@
         <w:rPr>
           <w:rFonts w:ascii="Arial" w:hAnsi="Arial" w:cs="Arial"/>
         </w:rPr>
-        <w:t xml:space="preserve">⁶, so the top node scores approximately 809× above the mean — a stark illustration of the power-law concentration of authority in real web graphs. Remarkably, node 537039 at rank 4 has the highest in-degree of the </w:t>
+        <w:t xml:space="preserve">⁶, putting it at roughly 809× the average. It is also worth noting that node 537039 at rank 4 has the highest in-degree in the </w:t>
       </w:r>
       <w:proofErr w:type="gramStart"/>
       <w:r>
@@ -4228,7 +4317,7 @@
         <w:rPr>
           <w:rFonts w:ascii="Arial" w:hAnsi="Arial" w:cs="Arial"/>
         </w:rPr>
-        <w:t xml:space="preserve"> ranks below 597621 and 41909 — demonstrating that PageRank is not simply proportional to in-degree, but depends on the authority of the linking pages. The power-law tail in Figure 3 shows that the top few hundred pages accumulate a disproportionate share of total rank mass, consistent with real-world web structure.</w:t>
+        <w:t xml:space="preserve"> still ranks below 597621 and 41909. Raw in-degree does not determine PageRank; the quality of the incoming links matters too. Figure 3 plots the full score distribution and the power-law tail is clearly visible.</w:t>
       </w:r>
     </w:p>
     <w:p>
@@ -4258,23 +4347,31 @@
           <w:sz w:val="28"/>
           <w:szCs w:val="28"/>
         </w:rPr>
+        <w:t>6.3 Power-Law Score Distribution</w:t>
+      </w:r>
+    </w:p>
+    <w:p>
+      <w:pPr>
+        <w:spacing w:before="80" w:after="120"/>
+        <w:rPr>
+          <w:rFonts w:ascii="Arial" w:hAnsi="Arial" w:cs="Arial"/>
+        </w:rPr>
+      </w:pPr>
+    </w:p>
+    <w:p>
+      <w:pPr>
+        <w:spacing w:before="80" w:after="120"/>
+        <w:jc w:val="center"/>
+        <w:rPr>
+          <w:rFonts w:ascii="Arial" w:hAnsi="Arial" w:cs="Arial"/>
+        </w:rPr>
+      </w:pPr>
+      <w:r>
+        <w:rPr>
+          <w:rFonts w:ascii="Arial" w:hAnsi="Arial" w:cs="Arial"/>
+          <w:noProof/>
+        </w:rPr>
         <w:lastRenderedPageBreak/>
-        <w:t>6.3 Power-Law Score Distribution</w:t>
-      </w:r>
-    </w:p>
-    <w:p>
-      <w:pPr>
-        <w:spacing w:before="80" w:after="120"/>
-        <w:jc w:val="center"/>
-        <w:rPr>
-          <w:rFonts w:ascii="Arial" w:hAnsi="Arial" w:cs="Arial"/>
-        </w:rPr>
-      </w:pPr>
-      <w:r>
-        <w:rPr>
-          <w:rFonts w:ascii="Arial" w:hAnsi="Arial" w:cs="Arial"/>
-          <w:noProof/>
-        </w:rPr>
         <w:drawing>
           <wp:inline distT="0" distB="0" distL="0" distR="0" wp14:anchorId="3BEEE26E" wp14:editId="56716575">
             <wp:extent cx="3810000" cy="2571750"/>
@@ -5628,7 +5725,7 @@
         <w:rPr>
           <w:rFonts w:ascii="Arial" w:hAnsi="Arial" w:cs="Arial"/>
         </w:rPr>
-        <w:t xml:space="preserve">Three observations stand out. First, the convergence speed panel reveals a dramatic effect: p = 0.05 requires 279 iterations to converge on the 50k subgraph (the real web-Google.txt graph has complex structure and many dangling nodes that slow spectral convergence), while p = 0.85 converges in just 9 — a 31× speedup that directly reflects the spectral gap widening with p. On the full 875k graph at p = 0.15 the full solver requires 118 iterations (vs 88 on the 50k subgraph), consistent with the larger graph having a denser dangling-node structure. Second, at p = 0.15 the Gini is 0.392 — the </w:t>
+        <w:t xml:space="preserve">Looking at the results, the most striking pattern is in the convergence column: p = 0.05 needs 279 iterations on the 50k subgraph while p = 0.85 needs only 9, a 31× difference that comes directly from the spectral gap widening as p grows. On the full 875k graph at p = 0.15, the solver needs 118 iterations rather than 88 — the larger and more complex graph with more dangling nodes makes convergence harder. On the inequality side, at p = 0.15 the Gini is 0.392 and the </w:t>
       </w:r>
       <w:proofErr w:type="gramStart"/>
       <w:r>
@@ -5642,72 +5739,106 @@
         <w:rPr>
           <w:rFonts w:ascii="Arial" w:hAnsi="Arial" w:cs="Arial"/>
         </w:rPr>
-        <w:t xml:space="preserve"> pages collectively hold 3.1% of total rank despite representing only 0.01% of the 50k subgraph. Third, entropy on the 50k subgraph approaches </w:t>
+        <w:t xml:space="preserve"> pages hold 3.1% of total rank despi</w:t>
+      </w:r>
+      <w:r>
+        <w:rPr>
+          <w:rFonts w:ascii="Arial" w:hAnsi="Arial" w:cs="Arial" w:hint="eastAsia"/>
+        </w:rPr>
+        <w:t xml:space="preserve">te being just 0.01% of the subgraph, so the distribution is quite concentrated. Entropy tells the same story from the other direction: it climbs toward </w:t>
       </w:r>
       <w:proofErr w:type="gramStart"/>
       <w:r>
         <w:rPr>
-          <w:rFonts w:ascii="Arial" w:hAnsi="Arial" w:cs="Arial"/>
+          <w:rFonts w:ascii="Arial" w:hAnsi="Arial" w:cs="Arial" w:hint="eastAsia"/>
         </w:rPr>
         <w:t>log(</w:t>
       </w:r>
       <w:proofErr w:type="gramEnd"/>
       <w:r>
         <w:rPr>
-          <w:rFonts w:ascii="Arial" w:hAnsi="Arial" w:cs="Arial"/>
-        </w:rPr>
-        <w:t xml:space="preserve">50,000) ≈ 10.82 </w:t>
+          <w:rFonts w:ascii="Arial" w:hAnsi="Arial" w:cs="Arial" w:hint="eastAsia"/>
+        </w:rPr>
+        <w:t xml:space="preserve">50,000) </w:t>
+      </w:r>
+      <w:r>
+        <w:rPr>
+          <w:rFonts w:ascii="Arial" w:hAnsi="Arial" w:cs="Arial" w:hint="eastAsia"/>
+        </w:rPr>
+        <w:t>≈</w:t>
+      </w:r>
+      <w:r>
+        <w:rPr>
+          <w:rFonts w:ascii="Arial" w:hAnsi="Arial" w:cs="Arial" w:hint="eastAsia"/>
+        </w:rPr>
+        <w:t xml:space="preserve"> 10.82 </w:t>
       </w:r>
       <w:proofErr w:type="spellStart"/>
       <w:r>
         <w:rPr>
-          <w:rFonts w:ascii="Arial" w:hAnsi="Arial" w:cs="Arial"/>
+          <w:rFonts w:ascii="Arial" w:hAnsi="Arial" w:cs="Arial" w:hint="eastAsia"/>
         </w:rPr>
         <w:t>nats</w:t>
       </w:r>
       <w:proofErr w:type="spellEnd"/>
       <w:r>
         <w:rPr>
-          <w:rFonts w:ascii="Arial" w:hAnsi="Arial" w:cs="Arial"/>
-        </w:rPr>
-        <w:t xml:space="preserve"> as p → 1; for the full 875,713-node graph the theoretical maximum is </w:t>
+          <w:rFonts w:ascii="Arial" w:hAnsi="Arial" w:cs="Arial" w:hint="eastAsia"/>
+        </w:rPr>
+        <w:t xml:space="preserve"> on the subgraph as p </w:t>
+      </w:r>
+      <w:r>
+        <w:rPr>
+          <w:rFonts w:ascii="Arial" w:hAnsi="Arial" w:cs="Arial" w:hint="eastAsia"/>
+        </w:rPr>
+        <w:t>→</w:t>
+      </w:r>
+      <w:r>
+        <w:rPr>
+          <w:rFonts w:ascii="Arial" w:hAnsi="Arial" w:cs="Arial" w:hint="eastAsia"/>
+        </w:rPr>
+        <w:t xml:space="preserve"> 1, while the theoretical ceiling for the full graph is </w:t>
       </w:r>
       <w:proofErr w:type="gramStart"/>
       <w:r>
         <w:rPr>
-          <w:rFonts w:ascii="Arial" w:hAnsi="Arial" w:cs="Arial"/>
+          <w:rFonts w:ascii="Arial" w:hAnsi="Arial" w:cs="Arial" w:hint="eastAsia"/>
         </w:rPr>
         <w:t>log(</w:t>
       </w:r>
       <w:proofErr w:type="gramEnd"/>
       <w:r>
         <w:rPr>
-          <w:rFonts w:ascii="Arial" w:hAnsi="Arial" w:cs="Arial"/>
-        </w:rPr>
-        <w:t xml:space="preserve">875,713) ≈ 13.68 </w:t>
+          <w:rFonts w:ascii="Arial" w:hAnsi="Arial" w:cs="Arial" w:hint="eastAsia"/>
+        </w:rPr>
+        <w:t xml:space="preserve">875,713) </w:t>
+      </w:r>
+      <w:r>
+        <w:rPr>
+          <w:rFonts w:ascii="Arial" w:hAnsi="Arial" w:cs="Arial" w:hint="eastAsia"/>
+        </w:rPr>
+        <w:t>≈</w:t>
+      </w:r>
+      <w:r>
+        <w:rPr>
+          <w:rFonts w:ascii="Arial" w:hAnsi="Arial" w:cs="Arial" w:hint="eastAsia"/>
+        </w:rPr>
+        <w:t xml:space="preserve"> 13.68 </w:t>
       </w:r>
       <w:proofErr w:type="spellStart"/>
       <w:r>
         <w:rPr>
-          <w:rFonts w:ascii="Arial" w:hAnsi="Arial" w:cs="Arial"/>
+          <w:rFonts w:ascii="Arial" w:hAnsi="Arial" w:cs="Arial" w:hint="eastAsia"/>
         </w:rPr>
         <w:t>nats</w:t>
       </w:r>
       <w:proofErr w:type="spellEnd"/>
       <w:r>
         <w:rPr>
-          <w:rFonts w:ascii="Arial" w:hAnsi="Arial" w:cs="Arial"/>
-        </w:rPr>
-        <w:t>, confirming that higher p drives the distribution toward uniform.</w:t>
-      </w:r>
-    </w:p>
-    <w:p>
-      <w:pPr>
-        <w:spacing w:before="80" w:after="120"/>
-        <w:rPr>
-          <w:rFonts w:ascii="Arial" w:hAnsi="Arial" w:cs="Arial"/>
-        </w:rPr>
-      </w:pPr>
+          <w:rFonts w:ascii="Arial" w:hAnsi="Arial" w:cs="Arial" w:hint="eastAsia"/>
+        </w:rPr>
+        <w:t>.</w:t>
+      </w:r>
     </w:p>
     <w:p>
       <w:pPr>
@@ -5805,16 +5936,7 @@
         <w:rPr>
           <w:rFonts w:ascii="Arial" w:hAnsi="Arial" w:cs="Arial"/>
         </w:rPr>
-        <w:t>OpenAI's GPTBot and similar crawlers collect training data for foundation models from the public web (https://</w:t>
-      </w:r>
-      <w:r>
-        <w:t xml:space="preserve"> </w:t>
-      </w:r>
-      <w:r>
-        <w:rPr>
-          <w:rFonts w:ascii="Arial" w:hAnsi="Arial" w:cs="Arial"/>
-        </w:rPr>
-        <w:t>developers.openai.com/</w:t>
+        <w:t>OpenAI's GPTBot and similar crawlers collect training data for foundation models from the public web (https:// developers.openai.com/</w:t>
       </w:r>
       <w:proofErr w:type="spellStart"/>
       <w:r>
@@ -5828,13 +5950,7 @@
         <w:rPr>
           <w:rFonts w:ascii="Arial" w:hAnsi="Arial" w:cs="Arial"/>
         </w:rPr>
-        <w:t>/docs/bots/</w:t>
-      </w:r>
-      <w:r>
-        <w:rPr>
-          <w:rFonts w:ascii="Arial" w:hAnsi="Arial" w:cs="Arial"/>
-        </w:rPr>
-        <w:t xml:space="preserve">). Website owners control crawler access via robots.txt (https://www.robotstxt.org/). As a new AI research organisation designing a GPTBot-like crawler, the core challenge is: given a directed web graph of </w:t>
+        <w:t xml:space="preserve">/docs/bots/). Website owners control crawler access via robots.txt (https://www.robotstxt.org/). As a new AI research organisation designing a GPTBot-like crawler, the core challenge is: given a directed web graph of </w:t>
       </w:r>
       <w:proofErr w:type="gramStart"/>
       <w:r>
@@ -5862,35 +5978,49 @@
         <w:rPr>
           <w:rFonts w:ascii="Arial" w:hAnsi="Arial" w:cs="Arial"/>
         </w:rPr>
-        <w:t xml:space="preserve">The program developed here takes exactly the inputs specified — a </w:t>
-      </w:r>
-      <w:proofErr w:type="gramStart"/>
-      <w:r>
-        <w:rPr>
-          <w:rFonts w:ascii="Arial" w:hAnsi="Arial" w:cs="Arial"/>
-        </w:rPr>
-        <w:t>small directed</w:t>
-      </w:r>
-      <w:proofErr w:type="gramEnd"/>
-      <w:r>
-        <w:rPr>
-          <w:rFonts w:ascii="Arial" w:hAnsi="Arial" w:cs="Arial"/>
-        </w:rPr>
-        <w:t xml:space="preserve"> web graph represented as a Python dictionary mapping URLs to their </w:t>
+        <w:t xml:space="preserve">The program takes a small URL graph (a Python </w:t>
       </w:r>
       <w:proofErr w:type="spellStart"/>
       <w:r>
         <w:rPr>
           <w:rFonts w:ascii="Arial" w:hAnsi="Arial" w:cs="Arial"/>
         </w:rPr>
-        <w:t>outlink</w:t>
+        <w:t>dict</w:t>
       </w:r>
       <w:proofErr w:type="spellEnd"/>
       <w:r>
         <w:rPr>
           <w:rFonts w:ascii="Arial" w:hAnsi="Arial" w:cs="Arial"/>
         </w:rPr>
-        <w:t xml:space="preserve"> lists, and precomputed PageRank scores — and returns the top k URLs to crawl based on authority and a content-richness heuristic, with robots.txt compliance enforced.</w:t>
+        <w:t xml:space="preserve"> mapping each URL to its </w:t>
+      </w:r>
+      <w:proofErr w:type="spellStart"/>
+      <w:r>
+        <w:rPr>
+          <w:rFonts w:ascii="Arial" w:hAnsi="Arial" w:cs="Arial"/>
+        </w:rPr>
+        <w:t>outlinks</w:t>
+      </w:r>
+      <w:proofErr w:type="spellEnd"/>
+      <w:r>
+        <w:rPr>
+          <w:rFonts w:ascii="Arial" w:hAnsi="Arial" w:cs="Arial"/>
+        </w:rPr>
+        <w:t xml:space="preserve">) and a </w:t>
+      </w:r>
+      <w:proofErr w:type="spellStart"/>
+      <w:r>
+        <w:rPr>
+          <w:rFonts w:ascii="Arial" w:hAnsi="Arial" w:cs="Arial"/>
+        </w:rPr>
+        <w:t>dict</w:t>
+      </w:r>
+      <w:proofErr w:type="spellEnd"/>
+      <w:r>
+        <w:rPr>
+          <w:rFonts w:ascii="Arial" w:hAnsi="Arial" w:cs="Arial"/>
+        </w:rPr>
+        <w:t xml:space="preserve"> of precomputed PageRank scores, then returns the top k URLs to crawl ranked by authority, with a content-richness check and robots.txt filtering applied.</w:t>
       </w:r>
     </w:p>
     <w:p>
@@ -5934,7 +6064,7 @@
         <w:rPr>
           <w:rFonts w:ascii="Arial" w:hAnsi="Arial" w:cs="Arial"/>
         </w:rPr>
-        <w:t>PageRank is a principled proxy for content quality in the context of AI training data for four reasons:</w:t>
+        <w:t>There are a few reasons why PageRank works reasonably well as a stand-in for content quality when building an LLM training corpus:</w:t>
       </w:r>
     </w:p>
     <w:p>
@@ -5942,7 +6072,7 @@
         <w:pStyle w:val="ListParagraph"/>
         <w:numPr>
           <w:ilvl w:val="0"/>
-          <w:numId w:val="5"/>
+          <w:numId w:val="7"/>
         </w:numPr>
         <w:spacing w:before="80" w:after="120"/>
         <w:rPr>
@@ -5953,7 +6083,7 @@
         <w:rPr>
           <w:rFonts w:ascii="Arial" w:hAnsi="Arial" w:cs="Arial"/>
         </w:rPr>
-        <w:t>Authority as a quality signal: A page with high PageRank receives links from many other high-authority pages. This encodes collective human editorial judgment — researchers, journalists, and developers chose to cite this page, implying it is accurate, well-written, and informative. For an LLM, these properties directly translate to higher-quality training signal per token.</w:t>
+        <w:t>Authority signal: High PageRank means the page is linked to by other well-regarded pages. That is essentially the collective judgment of many writers who chose to cite it — a reasonable indicator that the content is reliable and worth reading, which is what you want in training data.</w:t>
       </w:r>
     </w:p>
     <w:p>
@@ -5961,7 +6091,7 @@
         <w:pStyle w:val="ListParagraph"/>
         <w:numPr>
           <w:ilvl w:val="0"/>
-          <w:numId w:val="5"/>
+          <w:numId w:val="7"/>
         </w:numPr>
         <w:spacing w:before="80" w:after="120"/>
         <w:rPr>
@@ -5972,7 +6102,7 @@
         <w:rPr>
           <w:rFonts w:ascii="Arial" w:hAnsi="Arial" w:cs="Arial"/>
         </w:rPr>
-        <w:t>Factual density: High-PR pages (academic papers, encyclopaedia articles, technical documentation) contain dense, structured factual prose. Low-PR pages (login screens, search-result pages, auto-generated storefronts) contain boilerplate HTML with minimal training value.</w:t>
+        <w:t>Content density: High-PR pages tend to be papers, Wikipedia articles, or documentation — pages with actual informational content. Low-PR pages are more often login screens, search results, or auto-generated filler, which contribute very little to a training corpus.</w:t>
       </w:r>
     </w:p>
     <w:p>
@@ -5980,7 +6110,7 @@
         <w:pStyle w:val="ListParagraph"/>
         <w:numPr>
           <w:ilvl w:val="0"/>
-          <w:numId w:val="5"/>
+          <w:numId w:val="7"/>
         </w:numPr>
         <w:spacing w:before="80" w:after="120"/>
         <w:rPr>
@@ -5991,7 +6121,7 @@
         <w:rPr>
           <w:rFonts w:ascii="Arial" w:hAnsi="Arial" w:cs="Arial"/>
         </w:rPr>
-        <w:t>Natural filtering of junk content: Spam sites, thin affiliate pages, and duplicated content receive few authoritative in-links and therefore low PageRank. Prioritising by PR automatically deprioritises low-quality pages without requiring an expensive content classifier.</w:t>
+        <w:t>Spam filtering: Spam farms, thin affiliate pages, and duplicate content typically have low PageRank because trusted sites do not link to them. Sorting by PageRank therefore filters out a lot of low-quality pages without needing a separate classifier.</w:t>
       </w:r>
     </w:p>
     <w:p>
@@ -5999,7 +6129,7 @@
         <w:pStyle w:val="ListParagraph"/>
         <w:numPr>
           <w:ilvl w:val="0"/>
-          <w:numId w:val="5"/>
+          <w:numId w:val="7"/>
         </w:numPr>
         <w:spacing w:before="80" w:after="120"/>
         <w:rPr>
@@ -6010,7 +6140,7 @@
         <w:rPr>
           <w:rFonts w:ascii="Arial" w:hAnsi="Arial" w:cs="Arial"/>
         </w:rPr>
-        <w:t>Alignment with important concepts: The entities and facts that appear most frequently on high-PR pages are precisely those that humans consider most important — exactly what an LLM should learn well to be useful.</w:t>
+        <w:t>Concept coverage: The topics that appear repeatedly on high-PR pages are ones that humans have collectively decided are important enough to write about extensively and link to. Those are roughly the concepts an LLM needs to understand well.</w:t>
       </w:r>
     </w:p>
     <w:p>
@@ -7015,7 +7145,7 @@
         <w:rPr>
           <w:rFonts w:ascii="Arial" w:hAnsi="Arial" w:cs="Arial"/>
         </w:rPr>
-        <w:t>The proposed heuristic for identifying high-quality crawl-permitted pages is the Permissive-Authority Score:</w:t>
+        <w:t>The scoring approach used here is the Permissive-Authority Score:</w:t>
       </w:r>
     </w:p>
     <w:p>
@@ -7202,7 +7332,21 @@
         <w:rPr>
           <w:rFonts w:ascii="Arial" w:hAnsi="Arial" w:cs="Arial"/>
         </w:rPr>
-        <w:t>0.0 — if the URL matches a low-value pattern: /login, /logout, /cart, /checkout, /search?, /admin. These are transactional utility pages whose content is not useful for training a generative model.</w:t>
+        <w:t>0.0 — if the URL matches a low-value pattern: /login, /logout, /cart, /checkout, /</w:t>
+      </w:r>
+      <w:proofErr w:type="gramStart"/>
+      <w:r>
+        <w:rPr>
+          <w:rFonts w:ascii="Arial" w:hAnsi="Arial" w:cs="Arial"/>
+        </w:rPr>
+        <w:t>search?,</w:t>
+      </w:r>
+      <w:proofErr w:type="gramEnd"/>
+      <w:r>
+        <w:rPr>
+          <w:rFonts w:ascii="Arial" w:hAnsi="Arial" w:cs="Arial"/>
+        </w:rPr>
+        <w:t xml:space="preserve"> /admin. These are transactional utility pages whose content is not useful for training a generative model.</w:t>
       </w:r>
     </w:p>
     <w:p>
@@ -7235,14 +7379,28 @@
         <w:rPr>
           <w:rFonts w:ascii="Arial" w:hAnsi="Arial" w:cs="Arial"/>
         </w:rPr>
-        <w:t xml:space="preserve">Robots.txt compliance is checked per domain using simulated rules (in production: urllib.robotparser fetches and parses the live /robots.txt file). The alpha = 0.80 weight </w:t>
+        <w:t xml:space="preserve">Robots.txt compliance is checked per domain using simulated rules (in production: </w:t>
+      </w:r>
+      <w:proofErr w:type="gramStart"/>
+      <w:r>
+        <w:rPr>
+          <w:rFonts w:ascii="Arial" w:hAnsi="Arial" w:cs="Arial"/>
+        </w:rPr>
+        <w:t>urllib.robotparser</w:t>
+      </w:r>
+      <w:proofErr w:type="gramEnd"/>
+      <w:r>
+        <w:rPr>
+          <w:rFonts w:ascii="Arial" w:hAnsi="Arial" w:cs="Arial"/>
+        </w:rPr>
+        <w:t xml:space="preserve"> fetches and parses the live /robots.txt file). The alpha = 0.80 weight ensures that PageRank authority dominates, while the beta = 0.20 richness </w:t>
       </w:r>
       <w:r>
         <w:rPr>
           <w:rFonts w:ascii="Arial" w:hAnsi="Arial" w:cs="Arial"/>
         </w:rPr>
         <w:lastRenderedPageBreak/>
-        <w:t>ensures that PageRank authority dominates, while the beta = 0.20 richness component acts as a tiebreaker and quality filter — capable of demoting a high-PR but low-value page (e.g., a login page that receives many links) below a slightly lower-PR but content-rich academic page.</w:t>
+        <w:t>component acts as a tiebreaker and quality filter — capable of demoting a high-PR but low-value page (e.g., a login page that receives many links) below a slightly lower-PR but content-rich academic page.</w:t>
       </w:r>
     </w:p>
     <w:p>
@@ -7914,8 +8072,44 @@
         <w:rPr>
           <w:rFonts w:ascii="Arial" w:hAnsi="Arial" w:cs="Arial"/>
         </w:rPr>
-        <w:t>In the demo, openai.com/login, twitter.com/sama, and reddit.com/r/MachineLearning are excluded under the simulated robots policy. The /login exclusion reflects a path-specific rule (login pages are transactional and carry no training value regardless of permission). The social platform exclusions reflect the BLOCK rules in the simulation; in a production system, these would be determined by fetching and parsing each domain's live robots.txt via urllib.robotparser. Note that robots.txt is a crawler convention (RFC 9309) — it represents a request that crawlers are expected to honour, not an access-control mechanism. These exclusions illustrate the heuristic's practical value: even a high-PageRank page is correctly deprioritised when the simulated policy disallows crawling.</w:t>
-      </w:r>
+        <w:t xml:space="preserve">Three pages are dropped in the demo. The /login page is blocked by a path-specific rule since login pages carry no useful training content regardless of domain permissions. Twitter and Reddit are blocked because their simulated </w:t>
+      </w:r>
+      <w:proofErr w:type="gramStart"/>
+      <w:r>
+        <w:rPr>
+          <w:rFonts w:ascii="Arial" w:hAnsi="Arial" w:cs="Arial"/>
+        </w:rPr>
+        <w:t>robots</w:t>
+      </w:r>
+      <w:proofErr w:type="gramEnd"/>
+      <w:r>
+        <w:rPr>
+          <w:rFonts w:ascii="Arial" w:hAnsi="Arial" w:cs="Arial"/>
+        </w:rPr>
+        <w:t xml:space="preserve"> rules disallow third-party crawlers; in a real deployment this would come from fetching and parsing each domain's robots.txt with </w:t>
+      </w:r>
+      <w:proofErr w:type="gramStart"/>
+      <w:r>
+        <w:rPr>
+          <w:rFonts w:ascii="Arial" w:hAnsi="Arial" w:cs="Arial"/>
+        </w:rPr>
+        <w:t>urllib.robotparser</w:t>
+      </w:r>
+      <w:proofErr w:type="gramEnd"/>
+      <w:r>
+        <w:rPr>
+          <w:rFonts w:ascii="Arial" w:hAnsi="Arial" w:cs="Arial"/>
+        </w:rPr>
+        <w:t>. It is worth noting that robots.txt is a convention under RFC 9309 — it is a request that crawlers are expected to follow, not a technical access restriction. The practical point is that even a page with decent PageRank like openai.com/login (PR 0.068) gets removed from the queue once the policy says no.</w:t>
+      </w:r>
+    </w:p>
+    <w:p>
+      <w:pPr>
+        <w:spacing w:before="80" w:after="120"/>
+        <w:rPr>
+          <w:rFonts w:ascii="Arial" w:hAnsi="Arial" w:cs="Arial"/>
+        </w:rPr>
+      </w:pPr>
     </w:p>
     <w:p>
       <w:pPr>
@@ -7930,7 +8124,6 @@
           <w:rFonts w:ascii="Arial" w:hAnsi="Arial" w:cs="Arial"/>
           <w:noProof/>
         </w:rPr>
-        <w:lastRenderedPageBreak/>
         <w:drawing>
           <wp:inline distT="0" distB="0" distL="0" distR="0" wp14:anchorId="550F5D38" wp14:editId="4978127F">
             <wp:extent cx="5334000" cy="2028825"/>
@@ -7993,6 +8186,7 @@
           <w:sz w:val="18"/>
           <w:szCs w:val="18"/>
         </w:rPr>
+        <w:lastRenderedPageBreak/>
         <w:t xml:space="preserve">Figure 5. Left: Heuristic scores for all 12 URLs (blue = </w:t>
       </w:r>
       <w:proofErr w:type="gramStart"/>
@@ -8128,13 +8322,7 @@
         <w:rPr>
           <w:rFonts w:ascii="Arial" w:hAnsi="Arial" w:cs="Arial"/>
         </w:rPr>
-        <w:t>This report derived the closed-form PageRank formula r = [I − (1−p)</w:t>
-      </w:r>
-      <w:r>
-        <w:rPr>
-          <w:rFonts w:ascii="Arial" w:hAnsi="Arial" w:cs="Arial"/>
-        </w:rPr>
-        <w:t xml:space="preserve"> </w:t>
+        <w:t xml:space="preserve">The closed-form PageRank formula r = [I − (1−p) </w:t>
       </w:r>
       <w:proofErr w:type="gramStart"/>
       <w:r>
@@ -8154,7 +8342,7 @@
         <w:rPr>
           <w:rFonts w:ascii="Arial" w:hAnsi="Arial" w:cs="Arial"/>
         </w:rPr>
-        <w:t>¹ p v, interpreted through the Neumann series as a geometrically discounted sum over all random-walk path lengths. The teleportation parameter p controls a three-way trade-off between rank inequality (Gini), information content (entropy), and convergence speed. Three independent solvers — power iteration, direct sparse LU solve, and Monte Carlo random-walk simulation — were implemented and cross-validated, with power iteration and closed form agreeing to L1 error of 1.735×10</w:t>
+        <w:t>¹ p v was derived and interpreted through the Neumann series as a weighted sum over random walks of all lengths. The parameter p simultaneously affects rank inequality (Gini), entropy of the score distribution, and how fast power iteration converges. Three independently-coded solvers were cross-validated: power iteration and the closed form match to L1 error 1.735×10</w:t>
       </w:r>
       <w:r>
         <w:rPr>
@@ -8166,21 +8354,21 @@
         <w:rPr>
           <w:rFonts w:ascii="Arial" w:hAnsi="Arial" w:cs="Arial"/>
         </w:rPr>
-        <w:t>¹⁶ and Monte Carlo confirming cosine similarity of 0.9999 via a completely different computational path.</w:t>
-      </w:r>
-    </w:p>
-    <w:p>
-      <w:pPr>
-        <w:spacing w:before="80" w:after="120"/>
-        <w:rPr>
-          <w:rFonts w:ascii="Arial" w:hAnsi="Arial" w:cs="Arial"/>
-        </w:rPr>
-      </w:pPr>
-      <w:r>
-        <w:rPr>
-          <w:rFonts w:ascii="Arial" w:hAnsi="Arial" w:cs="Arial"/>
-        </w:rPr>
-        <w:t>On web-Google.txt (875,713 nodes, 5,105,039 edges), power iteration converged in 118 iterations in 3.333 seconds. The real graph's 136,259 dangling nodes (15.6%) required correct dangling-mass redistribution in the solver. The score distribution follows a power law: the top node (597621, in-degree 5,354) scores approximately 809× above the mean score of 1/875,713 ≈ 1.14×10</w:t>
+        <w:t>¹⁶, and the Monte Carlo simulator — which works by simulation rather than matrix algebra — also confirms cosine similarity 0.9999.</w:t>
+      </w:r>
+    </w:p>
+    <w:p>
+      <w:pPr>
+        <w:spacing w:before="80" w:after="120"/>
+        <w:rPr>
+          <w:rFonts w:ascii="Arial" w:hAnsi="Arial" w:cs="Arial"/>
+        </w:rPr>
+      </w:pPr>
+      <w:r>
+        <w:rPr>
+          <w:rFonts w:ascii="Arial" w:hAnsi="Arial" w:cs="Arial"/>
+        </w:rPr>
+        <w:t>Running on web-Google.txt (875,713 nodes, 5,105,039 edges), the solver converged in 118 iterations and 3.333 seconds. The 136,259 dangling nodes (15.6%) needed the dangling-mass redistribution to be handled properly, which is part of why convergence takes more iterations than on a cleaner graph. The resulting scores follow a power law — node 597621 scores about 809× the mean of 1.14×10</w:t>
       </w:r>
       <w:r>
         <w:rPr>
@@ -8192,30 +8380,22 @@
         <w:rPr>
           <w:rFonts w:ascii="Arial" w:hAnsi="Arial" w:cs="Arial"/>
         </w:rPr>
-        <w:t>⁶, consistent with real web graph authority concentration.</w:t>
-      </w:r>
-    </w:p>
-    <w:p>
-      <w:pPr>
-        <w:spacing w:before="80" w:after="120"/>
-        <w:rPr>
-          <w:rFonts w:ascii="Arial" w:hAnsi="Arial" w:cs="Arial"/>
-        </w:rPr>
-      </w:pPr>
-      <w:r>
-        <w:rPr>
-          <w:rFonts w:ascii="Arial" w:hAnsi="Arial" w:cs="Arial"/>
-        </w:rPr>
-        <w:t>The GPTBot-like crawler extension directly addresses the assignment specification: a program taking a URL-keyed web graph dictionary and precomputed PageRank scores returns the top k crawl candidates using the Permissive-Authority Heuristic, combining PageRank authority with URL content-richness classification and robots.txt compliance as hard constraints. The heuristic correctly surfaces high-value academic and encyclopaedic content while excluding transactional pages and robots.txt-blocked social platforms.</w:t>
-      </w:r>
-    </w:p>
-    <w:p>
-      <w:pPr>
-        <w:spacing w:before="80" w:after="120"/>
-        <w:rPr>
-          <w:rFonts w:ascii="Arial" w:hAnsi="Arial" w:cs="Arial"/>
-        </w:rPr>
-      </w:pPr>
+        <w:t>⁶, reflecting how concentrated link authority tends to be in real web data.</w:t>
+      </w:r>
+    </w:p>
+    <w:p>
+      <w:pPr>
+        <w:spacing w:before="80" w:after="120"/>
+        <w:rPr>
+          <w:rFonts w:ascii="Arial" w:hAnsi="Arial" w:cs="Arial"/>
+        </w:rPr>
+      </w:pPr>
+      <w:r>
+        <w:rPr>
+          <w:rFonts w:ascii="Arial" w:hAnsi="Arial" w:cs="Arial"/>
+        </w:rPr>
+        <w:t>For the extension, a crawler was built that takes a URL graph dictionary and precomputed PageRank scores as input and outputs the top k pages to crawl. The Permissive-Authority Heuristic scores each page using a weighted combination of its PageRank and a URL-pattern richness score, with robots.txt acting as a hard filter. In the demo, academic and reference pages come out on top while login pages and social media accounts are correctly excluded.</w:t>
+      </w:r>
     </w:p>
     <w:p>
       <w:pPr>
@@ -8508,6 +8688,119 @@
 <file path=word/numbering.xml><?xml version="1.0" encoding="utf-8"?>
 <w:numbering xmlns:wpc="http://schemas.microsoft.com/office/word/2010/wordprocessingCanvas" xmlns:cx="http://schemas.microsoft.com/office/drawing/2014/chartex" xmlns:cx1="http://schemas.microsoft.com/office/drawing/2015/9/8/chartex" xmlns:cx2="http://schemas.microsoft.com/office/drawing/2015/10/21/chartex" xmlns:cx3="http://schemas.microsoft.com/office/drawing/2016/5/9/chartex" xmlns:cx4="http://schemas.microsoft.com/office/drawing/2016/5/10/chartex" xmlns:cx5="http://schemas.microsoft.com/office/drawing/2016/5/11/chartex" xmlns:cx6="http://schemas.microsoft.com/office/drawing/2016/5/12/chartex" xmlns:cx7="http://schemas.microsoft.com/office/drawing/2016/5/13/chartex" xmlns:cx8="http://schemas.microsoft.com/office/drawing/2016/5/14/chartex" xmlns:mc="http://schemas.openxmlformats.org/markup-compatibility/2006" xmlns:aink="http://schemas.microsoft.com/office/drawing/2016/ink" xmlns:am3d="http://schemas.microsoft.com/office/drawing/2017/model3d" xmlns:o="urn:schemas-microsoft-com:office:office" xmlns:oel="http://schemas.microsoft.com/office/2019/extlst" xmlns:r="http://schemas.openxmlformats.org/officeDocument/2006/relationships" xmlns:m="http://schemas.openxmlformats.org/officeDocument/2006/math" xmlns:v="urn:schemas-microsoft-com:vml" xmlns:wp14="http://schemas.microsoft.com/office/word/2010/wordprocessingDrawing" xmlns:wp="http://schemas.openxmlformats.org/drawingml/2006/wordprocessingDrawing" xmlns:w10="urn:schemas-microsoft-com:office:word" xmlns:w="http://schemas.openxmlformats.org/wordprocessingml/2006/main" xmlns:w14="http://schemas.microsoft.com/office/word/2010/wordml" xmlns:w15="http://schemas.microsoft.com/office/word/2012/wordml" xmlns:w16cex="http://schemas.microsoft.com/office/word/2018/wordml/cex" xmlns:w16cid="http://schemas.microsoft.com/office/word/2016/wordml/cid" xmlns:w16="http://schemas.microsoft.com/office/word/2018/wordml" xmlns:w16du="http://schemas.microsoft.com/office/word/2023/wordml/word16du" xmlns:w16sdtdh="http://schemas.microsoft.com/office/word/2020/wordml/sdtdatahash" xmlns:w16sdtfl="http://schemas.microsoft.com/office/word/2024/wordml/sdtformatlock" xmlns:w16se="http://schemas.microsoft.com/office/word/2015/wordml/symex" xmlns:wpg="http://schemas.microsoft.com/office/word/2010/wordprocessingGroup" xmlns:wpi="http://schemas.microsoft.com/office/word/2010/wordprocessingInk" xmlns:wne="http://schemas.microsoft.com/office/word/2006/wordml" xmlns:wps="http://schemas.microsoft.com/office/word/2010/wordprocessingShape" mc:Ignorable="w14 w15 w16se w16cid w16 w16cex w16sdtdh w16sdtfl w16du wp14">
   <w:abstractNum w:abstractNumId="0" w15:restartNumberingAfterBreak="0">
+    <w:nsid w:val="1E2D5A0D"/>
+    <w:multiLevelType w:val="hybridMultilevel"/>
+    <w:tmpl w:val="FF6A436C"/>
+    <w:lvl w:ilvl="0" w:tplc="48090001">
+      <w:start w:val="1"/>
+      <w:numFmt w:val="bullet"/>
+      <w:lvlText w:val=""/>
+      <w:lvlJc w:val="left"/>
+      <w:pPr>
+        <w:ind w:left="720" w:hanging="360"/>
+      </w:pPr>
+      <w:rPr>
+        <w:rFonts w:ascii="Symbol" w:hAnsi="Symbol" w:hint="default"/>
+      </w:rPr>
+    </w:lvl>
+    <w:lvl w:ilvl="1" w:tplc="48090003" w:tentative="1">
+      <w:start w:val="1"/>
+      <w:numFmt w:val="bullet"/>
+      <w:lvlText w:val="o"/>
+      <w:lvlJc w:val="left"/>
+      <w:pPr>
+        <w:ind w:left="1440" w:hanging="360"/>
+      </w:pPr>
+      <w:rPr>
+        <w:rFonts w:ascii="Courier New" w:hAnsi="Courier New" w:cs="Courier New" w:hint="default"/>
+      </w:rPr>
+    </w:lvl>
+    <w:lvl w:ilvl="2" w:tplc="48090005" w:tentative="1">
+      <w:start w:val="1"/>
+      <w:numFmt w:val="bullet"/>
+      <w:lvlText w:val=""/>
+      <w:lvlJc w:val="left"/>
+      <w:pPr>
+        <w:ind w:left="2160" w:hanging="360"/>
+      </w:pPr>
+      <w:rPr>
+        <w:rFonts w:ascii="Wingdings" w:hAnsi="Wingdings" w:hint="default"/>
+      </w:rPr>
+    </w:lvl>
+    <w:lvl w:ilvl="3" w:tplc="48090001" w:tentative="1">
+      <w:start w:val="1"/>
+      <w:numFmt w:val="bullet"/>
+      <w:lvlText w:val=""/>
+      <w:lvlJc w:val="left"/>
+      <w:pPr>
+        <w:ind w:left="2880" w:hanging="360"/>
+      </w:pPr>
+      <w:rPr>
+        <w:rFonts w:ascii="Symbol" w:hAnsi="Symbol" w:hint="default"/>
+      </w:rPr>
+    </w:lvl>
+    <w:lvl w:ilvl="4" w:tplc="48090003" w:tentative="1">
+      <w:start w:val="1"/>
+      <w:numFmt w:val="bullet"/>
+      <w:lvlText w:val="o"/>
+      <w:lvlJc w:val="left"/>
+      <w:pPr>
+        <w:ind w:left="3600" w:hanging="360"/>
+      </w:pPr>
+      <w:rPr>
+        <w:rFonts w:ascii="Courier New" w:hAnsi="Courier New" w:cs="Courier New" w:hint="default"/>
+      </w:rPr>
+    </w:lvl>
+    <w:lvl w:ilvl="5" w:tplc="48090005" w:tentative="1">
+      <w:start w:val="1"/>
+      <w:numFmt w:val="bullet"/>
+      <w:lvlText w:val=""/>
+      <w:lvlJc w:val="left"/>
+      <w:pPr>
+        <w:ind w:left="4320" w:hanging="360"/>
+      </w:pPr>
+      <w:rPr>
+        <w:rFonts w:ascii="Wingdings" w:hAnsi="Wingdings" w:hint="default"/>
+      </w:rPr>
+    </w:lvl>
+    <w:lvl w:ilvl="6" w:tplc="48090001" w:tentative="1">
+      <w:start w:val="1"/>
+      <w:numFmt w:val="bullet"/>
+      <w:lvlText w:val=""/>
+      <w:lvlJc w:val="left"/>
+      <w:pPr>
+        <w:ind w:left="5040" w:hanging="360"/>
+      </w:pPr>
+      <w:rPr>
+        <w:rFonts w:ascii="Symbol" w:hAnsi="Symbol" w:hint="default"/>
+      </w:rPr>
+    </w:lvl>
+    <w:lvl w:ilvl="7" w:tplc="48090003" w:tentative="1">
+      <w:start w:val="1"/>
+      <w:numFmt w:val="bullet"/>
+      <w:lvlText w:val="o"/>
+      <w:lvlJc w:val="left"/>
+      <w:pPr>
+        <w:ind w:left="5760" w:hanging="360"/>
+      </w:pPr>
+      <w:rPr>
+        <w:rFonts w:ascii="Courier New" w:hAnsi="Courier New" w:cs="Courier New" w:hint="default"/>
+      </w:rPr>
+    </w:lvl>
+    <w:lvl w:ilvl="8" w:tplc="48090005" w:tentative="1">
+      <w:start w:val="1"/>
+      <w:numFmt w:val="bullet"/>
+      <w:lvlText w:val=""/>
+      <w:lvlJc w:val="left"/>
+      <w:pPr>
+        <w:ind w:left="6480" w:hanging="360"/>
+      </w:pPr>
+      <w:rPr>
+        <w:rFonts w:ascii="Wingdings" w:hAnsi="Wingdings" w:hint="default"/>
+      </w:rPr>
+    </w:lvl>
+  </w:abstractNum>
+  <w:abstractNum w:abstractNumId="1" w15:restartNumberingAfterBreak="0">
     <w:nsid w:val="2E0E06F8"/>
     <w:multiLevelType w:val="hybridMultilevel"/>
     <w:tmpl w:val="2A460512"/>
@@ -8596,7 +8889,7 @@
       </w:pPr>
     </w:lvl>
   </w:abstractNum>
-  <w:abstractNum w:abstractNumId="1" w15:restartNumberingAfterBreak="0">
+  <w:abstractNum w:abstractNumId="2" w15:restartNumberingAfterBreak="0">
     <w:nsid w:val="33CC4ABE"/>
     <w:multiLevelType w:val="hybridMultilevel"/>
     <w:tmpl w:val="1BD874EA"/>
@@ -8685,7 +8978,7 @@
       </w:pPr>
     </w:lvl>
   </w:abstractNum>
-  <w:abstractNum w:abstractNumId="2" w15:restartNumberingAfterBreak="0">
+  <w:abstractNum w:abstractNumId="3" w15:restartNumberingAfterBreak="0">
     <w:nsid w:val="4A2400F3"/>
     <w:multiLevelType w:val="hybridMultilevel"/>
     <w:tmpl w:val="47EA2F66"/>
@@ -8798,7 +9091,7 @@
       </w:rPr>
     </w:lvl>
   </w:abstractNum>
-  <w:abstractNum w:abstractNumId="3" w15:restartNumberingAfterBreak="0">
+  <w:abstractNum w:abstractNumId="4" w15:restartNumberingAfterBreak="0">
     <w:nsid w:val="6F7E1643"/>
     <w:multiLevelType w:val="hybridMultilevel"/>
     <w:tmpl w:val="90A4575C"/>
@@ -8911,7 +9204,7 @@
       </w:rPr>
     </w:lvl>
   </w:abstractNum>
-  <w:abstractNum w:abstractNumId="4" w15:restartNumberingAfterBreak="0">
+  <w:abstractNum w:abstractNumId="5" w15:restartNumberingAfterBreak="0">
     <w:nsid w:val="777B72A6"/>
     <w:multiLevelType w:val="hybridMultilevel"/>
     <w:tmpl w:val="32F43742"/>
@@ -9024,7 +9317,7 @@
       </w:rPr>
     </w:lvl>
   </w:abstractNum>
-  <w:abstractNum w:abstractNumId="5" w15:restartNumberingAfterBreak="0">
+  <w:abstractNum w:abstractNumId="6" w15:restartNumberingAfterBreak="0">
     <w:nsid w:val="7CE35BEB"/>
     <w:multiLevelType w:val="hybridMultilevel"/>
     <w:tmpl w:val="439AD392"/>
@@ -9138,22 +9431,25 @@
     </w:lvl>
   </w:abstractNum>
   <w:num w:numId="1" w16cid:durableId="777680385">
+    <w:abstractNumId w:val="2"/>
+  </w:num>
+  <w:num w:numId="2" w16cid:durableId="1324745220">
     <w:abstractNumId w:val="1"/>
   </w:num>
-  <w:num w:numId="2" w16cid:durableId="1324745220">
-    <w:abstractNumId w:val="0"/>
+  <w:num w:numId="3" w16cid:durableId="820343288">
+    <w:abstractNumId w:val="5"/>
   </w:num>
-  <w:num w:numId="3" w16cid:durableId="820343288">
+  <w:num w:numId="4" w16cid:durableId="1042176108">
+    <w:abstractNumId w:val="6"/>
+  </w:num>
+  <w:num w:numId="5" w16cid:durableId="1732118530">
     <w:abstractNumId w:val="4"/>
   </w:num>
-  <w:num w:numId="4" w16cid:durableId="1042176108">
-    <w:abstractNumId w:val="5"/>
-  </w:num>
-  <w:num w:numId="5" w16cid:durableId="1732118530">
+  <w:num w:numId="6" w16cid:durableId="9722617">
     <w:abstractNumId w:val="3"/>
   </w:num>
-  <w:num w:numId="6" w16cid:durableId="9722617">
-    <w:abstractNumId w:val="2"/>
+  <w:num w:numId="7" w16cid:durableId="820779740">
+    <w:abstractNumId w:val="0"/>
   </w:num>
 </w:numbering>
 </file>
@@ -9760,7 +10056,6 @@
   <w:style w:type="character" w:default="1" w:styleId="DefaultParagraphFont">
     <w:name w:val="Default Paragraph Font"/>
     <w:uiPriority w:val="1"/>
-    <w:semiHidden/>
     <w:unhideWhenUsed/>
   </w:style>
   <w:style w:type="table" w:default="1" w:styleId="TableNormal">

</xml_diff>